<commit_message>
Radar 2: refresh screened full and short Words
</commit_message>
<xml_diff>
--- a/stuff/WORLD_RADAR_20_BEST_20_TO_RECHECK.docx
+++ b/stuff/WORLD_RADAR_20_BEST_20_TO_RECHECK.docx
@@ -20,7 +20,7 @@
     </w:p>
     <w:p>
       <w:r>
-        <w:t>Based on World Radar's living atlas (2026-10-21 14:20 UTC). 1,366 older and newer research entries available. This shortlist updates when Radar 2 publishes new data.</w:t>
+        <w:t>Based on World Radar's living atlas (2026-10-21 15:46 UTC). 1,366 older and newer research entries available. This shortlist updates when Radar 2 publishes new data.</w:t>
       </w:r>
     </w:p>
     <w:p>
@@ -69,7 +69,7 @@
         <w:t xml:space="preserve">WHY HERE  </w:t>
       </w:r>
       <w:r>
-        <w:t>This trail has 5 distinct candidate later paper(s), reaching 2026. Titles suggest a topic connection, not an observed outcome. The publications need source review.</w:t>
+        <w:t>This trail has 6 distinct candidate later paper(s), reaching 2026. Titles suggest a topic connection, not an observed outcome. The publications need source review.</w:t>
       </w:r>
     </w:p>
     <w:p>
@@ -161,7 +161,7 @@
         <w:keepNext/>
       </w:pPr>
       <w:r>
-        <w:t>03.  The Experience Economy as the Future for European Agriculture and Food?  (2012)</w:t>
+        <w:t>03.  Mobility partnerships - the future of European migration policy?  (2012)</w:t>
       </w:r>
     </w:p>
     <w:p>
@@ -172,7 +172,7 @@
         <w:t xml:space="preserve">NOW  </w:t>
       </w:r>
       <w:r>
-        <w:t>A related study appeared in 2019: New Economy, Food, and Agriculture.</w:t>
+        <w:t>A related study appeared in 2026: Migration and Mobility Partnerships in German Migration Policy.</w:t>
       </w:r>
     </w:p>
     <w:p>
@@ -183,7 +183,7 @@
         <w:t xml:space="preserve">WHY HERE  </w:t>
       </w:r>
       <w:r>
-        <w:t>This trail has 9 distinct candidate later paper(s), reaching 2026. Titles suggest a topic connection, not an observed outcome. The publications need source review.</w:t>
+        <w:t>This trail has 3 distinct candidate later paper(s), reaching 2026. Titles suggest a topic connection, not an observed outcome. The publications need source review.</w:t>
       </w:r>
     </w:p>
     <w:p>
@@ -218,7 +218,7 @@
         <w:keepNext/>
       </w:pPr>
       <w:r>
-        <w:t>04.  Mobility partnerships - the future of European migration policy?  (2012)</w:t>
+        <w:t>04.  Sustainable fashion supply chain management: the European scenario  (2014)</w:t>
       </w:r>
     </w:p>
     <w:p>
@@ -229,7 +229,7 @@
         <w:t xml:space="preserve">NOW  </w:t>
       </w:r>
       <w:r>
-        <w:t>A related study appeared in 2026: Migration and Mobility Partnerships in German Migration Policy.</w:t>
+        <w:t>A related study appeared in 2018: Sustainable Fashion Supply Chain Management: A System of Systems Analysis.</w:t>
       </w:r>
     </w:p>
     <w:p>
@@ -240,7 +240,7 @@
         <w:t xml:space="preserve">WHY HERE  </w:t>
       </w:r>
       <w:r>
-        <w:t>This trail has 3 distinct candidate later paper(s), reaching 2026. Titles suggest a topic connection, not an observed outcome. The publications need source review.</w:t>
+        <w:t>This trail has 11 distinct candidate later paper(s), reaching 2026. Titles suggest a topic connection, not an observed outcome. The publications need source review.</w:t>
       </w:r>
     </w:p>
     <w:p>
@@ -275,7 +275,7 @@
         <w:keepNext/>
       </w:pPr>
       <w:r>
-        <w:t>05.  Sustainable fashion supply chain management: the European scenario  (2014)</w:t>
+        <w:t>05.  Towards the European Health Data Space (EHDS) ecosystem: A survey research on future health data scenarios  (2023)</w:t>
       </w:r>
     </w:p>
     <w:p>
@@ -286,7 +286,7 @@
         <w:t xml:space="preserve">NOW  </w:t>
       </w:r>
       <w:r>
-        <w:t>A related study appeared in 2018: Sustainable Fashion Supply Chain Management: A System of Systems Analysis.</w:t>
+        <w:t>A related study appeared in 2026: Health Data with the European Health Data Space (EHDS).</w:t>
       </w:r>
     </w:p>
     <w:p>
@@ -332,7 +332,7 @@
         <w:keepNext/>
       </w:pPr>
       <w:r>
-        <w:t>06.  Towards the European Health Data Space (EHDS) ecosystem: A survey research on future health data scenarios  (2023)</w:t>
+        <w:t>06.  The future of professional football  (2016)</w:t>
       </w:r>
     </w:p>
     <w:p>
@@ -343,7 +343,7 @@
         <w:t xml:space="preserve">NOW  </w:t>
       </w:r>
       <w:r>
-        <w:t>A related study appeared in 2026: Health Data with the European Health Data Space (EHDS).</w:t>
+        <w:t>A related study appeared in 2018: Economics of professional football.</w:t>
       </w:r>
     </w:p>
     <w:p>
@@ -354,7 +354,7 @@
         <w:t xml:space="preserve">WHY HERE  </w:t>
       </w:r>
       <w:r>
-        <w:t>This trail has 9 distinct candidate later paper(s), reaching 2026. Titles suggest a topic connection, not an observed outcome. The publications need source review.</w:t>
+        <w:t>This trail has 4 distinct candidate later paper(s), reaching 2026. Titles suggest a topic connection, not an observed outcome. The publications need source review.</w:t>
       </w:r>
     </w:p>
     <w:p>
@@ -389,7 +389,7 @@
         <w:keepNext/>
       </w:pPr>
       <w:r>
-        <w:t>07.  The future of professional football  (2016)</w:t>
+        <w:t>07.  The future of financial markets and regulation: what strategy for Europe?  (2014)</w:t>
       </w:r>
     </w:p>
     <w:p>
@@ -400,7 +400,7 @@
         <w:t xml:space="preserve">NOW  </w:t>
       </w:r>
       <w:r>
-        <w:t>A related study appeared in 2018: Economics of professional football.</w:t>
+        <w:t>A related study appeared in 2026: What Is Financial Regulation?.</w:t>
       </w:r>
     </w:p>
     <w:p>
@@ -411,7 +411,7 @@
         <w:t xml:space="preserve">WHY HERE  </w:t>
       </w:r>
       <w:r>
-        <w:t>This trail has 5 distinct candidate later paper(s), reaching 2026. Titles suggest a topic connection, not an observed outcome. The publications need source review.</w:t>
+        <w:t>This trail has 6 distinct candidate later paper(s), reaching 2026. Titles suggest a topic connection, not an observed outcome. The publications need source review.</w:t>
       </w:r>
     </w:p>
     <w:p>
@@ -446,7 +446,7 @@
         <w:keepNext/>
       </w:pPr>
       <w:r>
-        <w:t>08.  The future of financial markets and regulation: what strategy for Europe?  (2014)</w:t>
+        <w:t>08.  Technology Planning for Energy and Climate in the US and EU  (2013)</w:t>
       </w:r>
     </w:p>
     <w:p>
@@ -457,7 +457,7 @@
         <w:t xml:space="preserve">NOW  </w:t>
       </w:r>
       <w:r>
-        <w:t>A related study appeared in 2026: What Is Financial Regulation?.</w:t>
+        <w:t>A related study appeared in 2024: Research on New Energy Development Planning Technology.</w:t>
       </w:r>
     </w:p>
     <w:p>
@@ -468,7 +468,7 @@
         <w:t xml:space="preserve">WHY HERE  </w:t>
       </w:r>
       <w:r>
-        <w:t>This trail has 3 distinct candidate later paper(s), reaching 2026. Titles suggest a topic connection, not an observed outcome. The publications need source review.</w:t>
+        <w:t>This trail has 4 distinct candidate later paper(s), reaching 2025. Titles suggest a topic connection, not an observed outcome. The publications need source review.</w:t>
       </w:r>
     </w:p>
     <w:p>
@@ -525,7 +525,7 @@
         <w:t xml:space="preserve">WHY HERE  </w:t>
       </w:r>
       <w:r>
-        <w:t>This trail has 3 distinct candidate later paper(s), reaching 2026. Titles suggest a topic connection, not an observed outcome. The publications need source review.</w:t>
+        <w:t>This trail has 4 distinct candidate later paper(s), reaching 2026. Titles suggest a topic connection, not an observed outcome. The publications need source review.</w:t>
       </w:r>
     </w:p>
     <w:p>
@@ -639,7 +639,7 @@
         <w:t xml:space="preserve">WHY HERE  </w:t>
       </w:r>
       <w:r>
-        <w:t>This trail has 4 distinct candidate later paper(s), reaching 2026. Titles suggest a topic connection, not an observed outcome. The publications need source review.</w:t>
+        <w:t>This trail has 8 distinct candidate later paper(s), reaching 2026. Titles suggest a topic connection, not an observed outcome. The publications need source review.</w:t>
       </w:r>
     </w:p>
     <w:p>
@@ -1130,7 +1130,7 @@
         <w:keepNext/>
       </w:pPr>
       <w:r>
-        <w:t>20.  How to finance the transition to low-carbon energy in Europe?  (2020)</w:t>
+        <w:t>20.  Global food security: assessing trends in view of guiding future EU policies  (2016)</w:t>
       </w:r>
     </w:p>
     <w:p>
@@ -1141,7 +1141,7 @@
         <w:t xml:space="preserve">NOW  </w:t>
       </w:r>
       <w:r>
-        <w:t>A related study appeared in 2023: Digital finance and the low-carbon energy transition (LCET) from the perspective of capital-biased technical progress.</w:t>
+        <w:t>A related study appeared in 2022: Global food security: trends and challenges.</w:t>
       </w:r>
     </w:p>
     <w:p>
@@ -1152,7 +1152,7 @@
         <w:t xml:space="preserve">WHY HERE  </w:t>
       </w:r>
       <w:r>
-        <w:t>This trail has 10 distinct candidate later paper(s), reaching 2026. Titles suggest a topic connection, not an observed outcome. The publications need source review.</w:t>
+        <w:t>This trail has 4 distinct candidate later paper(s), reaching 2025. Titles suggest a topic connection, not an observed outcome. The publications need source review.</w:t>
       </w:r>
     </w:p>
     <w:p>

</xml_diff>

<commit_message>
Radar 2: quarantine weak evidence and refresh reports
</commit_message>
<xml_diff>
--- a/stuff/WORLD_RADAR_20_BEST_20_TO_RECHECK.docx
+++ b/stuff/WORLD_RADAR_20_BEST_20_TO_RECHECK.docx
@@ -20,7 +20,7 @@
     </w:p>
     <w:p>
       <w:r>
-        <w:t>Based on World Radar's living atlas (2026-10-21 15:46 UTC). 1,366 older and newer research entries available. This shortlist updates when Radar 2 publishes new data.</w:t>
+        <w:t>Based on World Radar's living atlas (2026-10-21 16:04 UTC). 1,366 older and newer research entries available. This shortlist updates when Radar 2 publishes new data.</w:t>
       </w:r>
     </w:p>
     <w:p>
@@ -47,7 +47,7 @@
         <w:keepNext/>
       </w:pPr>
       <w:r>
-        <w:t>01.  European scenarios for exposure of soil organisms to pesticides  (2013)</w:t>
+        <w:t>01.  The Future of Internationalization of Higher Education in Europe  (2015)</w:t>
       </w:r>
     </w:p>
     <w:p>
@@ -58,7 +58,7 @@
         <w:t xml:space="preserve">NOW  </w:t>
       </w:r>
       <w:r>
-        <w:t>A related study appeared in 2021: Russian scenarios for exposure assessment of pesticides to soil organisms.</w:t>
+        <w:t>A related study appeared in 2026: Internationalization of Higher Education in Vietnam.</w:t>
       </w:r>
     </w:p>
     <w:p>
@@ -69,7 +69,7 @@
         <w:t xml:space="preserve">WHY HERE  </w:t>
       </w:r>
       <w:r>
-        <w:t>This trail has 6 distinct candidate later paper(s), reaching 2026. Titles suggest a topic connection, not an observed outcome. The publications need source review.</w:t>
+        <w:t>This trail has 4 distinct candidate later paper(s), reaching 2026. Titles suggest a topic connection, not an observed outcome. The publications need source review.</w:t>
       </w:r>
     </w:p>
     <w:p>
@@ -104,7 +104,7 @@
         <w:keepNext/>
       </w:pPr>
       <w:r>
-        <w:t>02.  The Future of Internationalization of Higher Education in Europe  (2015)</w:t>
+        <w:t>02.  Sustainable fashion supply chain management: the European scenario  (2014)</w:t>
       </w:r>
     </w:p>
     <w:p>
@@ -115,7 +115,7 @@
         <w:t xml:space="preserve">NOW  </w:t>
       </w:r>
       <w:r>
-        <w:t>A related study appeared in 2026: Internationalization of Higher Education in Vietnam.</w:t>
+        <w:t>A related study appeared in 2018: Sustainable Fashion Supply Chain Management: A System of Systems Analysis.</w:t>
       </w:r>
     </w:p>
     <w:p>
@@ -126,7 +126,7 @@
         <w:t xml:space="preserve">WHY HERE  </w:t>
       </w:r>
       <w:r>
-        <w:t>This trail has 4 distinct candidate later paper(s), reaching 2026. Titles suggest a topic connection, not an observed outcome. The publications need source review.</w:t>
+        <w:t>This trail has 10 distinct candidate later paper(s), reaching 2026. Titles suggest a topic connection, not an observed outcome. The publications need source review.</w:t>
       </w:r>
     </w:p>
     <w:p>
@@ -161,7 +161,7 @@
         <w:keepNext/>
       </w:pPr>
       <w:r>
-        <w:t>03.  Mobility partnerships - the future of European migration policy?  (2012)</w:t>
+        <w:t>03.  Towards the European Health Data Space (EHDS) ecosystem: A survey research on future health data scenarios  (2023)</w:t>
       </w:r>
     </w:p>
     <w:p>
@@ -172,7 +172,7 @@
         <w:t xml:space="preserve">NOW  </w:t>
       </w:r>
       <w:r>
-        <w:t>A related study appeared in 2026: Migration and Mobility Partnerships in German Migration Policy.</w:t>
+        <w:t>A related study appeared in 2026: Health Data with the European Health Data Space (EHDS).</w:t>
       </w:r>
     </w:p>
     <w:p>
@@ -183,7 +183,7 @@
         <w:t xml:space="preserve">WHY HERE  </w:t>
       </w:r>
       <w:r>
-        <w:t>This trail has 3 distinct candidate later paper(s), reaching 2026. Titles suggest a topic connection, not an observed outcome. The publications need source review.</w:t>
+        <w:t>This trail has 11 distinct candidate later paper(s), reaching 2026. Titles suggest a topic connection, not an observed outcome. The publications need source review.</w:t>
       </w:r>
     </w:p>
     <w:p>
@@ -218,7 +218,7 @@
         <w:keepNext/>
       </w:pPr>
       <w:r>
-        <w:t>04.  Sustainable fashion supply chain management: the European scenario  (2014)</w:t>
+        <w:t>04.  The future of professional football  (2016)</w:t>
       </w:r>
     </w:p>
     <w:p>
@@ -229,7 +229,7 @@
         <w:t xml:space="preserve">NOW  </w:t>
       </w:r>
       <w:r>
-        <w:t>A related study appeared in 2018: Sustainable Fashion Supply Chain Management: A System of Systems Analysis.</w:t>
+        <w:t>A related study appeared in 2018: Economics of professional football.</w:t>
       </w:r>
     </w:p>
     <w:p>
@@ -240,7 +240,7 @@
         <w:t xml:space="preserve">WHY HERE  </w:t>
       </w:r>
       <w:r>
-        <w:t>This trail has 11 distinct candidate later paper(s), reaching 2026. Titles suggest a topic connection, not an observed outcome. The publications need source review.</w:t>
+        <w:t>This trail has 4 distinct candidate later paper(s), reaching 2026. Titles suggest a topic connection, not an observed outcome. The publications need source review.</w:t>
       </w:r>
     </w:p>
     <w:p>
@@ -275,7 +275,7 @@
         <w:keepNext/>
       </w:pPr>
       <w:r>
-        <w:t>05.  Towards the European Health Data Space (EHDS) ecosystem: A survey research on future health data scenarios  (2023)</w:t>
+        <w:t>05.  The future of financial markets and regulation: what strategy for Europe?  (2014)</w:t>
       </w:r>
     </w:p>
     <w:p>
@@ -286,7 +286,7 @@
         <w:t xml:space="preserve">NOW  </w:t>
       </w:r>
       <w:r>
-        <w:t>A related study appeared in 2026: Health Data with the European Health Data Space (EHDS).</w:t>
+        <w:t>A related study appeared in 2026: What Is Financial Regulation?.</w:t>
       </w:r>
     </w:p>
     <w:p>
@@ -297,7 +297,7 @@
         <w:t xml:space="preserve">WHY HERE  </w:t>
       </w:r>
       <w:r>
-        <w:t>This trail has 11 distinct candidate later paper(s), reaching 2026. Titles suggest a topic connection, not an observed outcome. The publications need source review.</w:t>
+        <w:t>This trail has 5 distinct candidate later paper(s), reaching 2026. Titles suggest a topic connection, not an observed outcome. The publications need source review.</w:t>
       </w:r>
     </w:p>
     <w:p>
@@ -332,7 +332,7 @@
         <w:keepNext/>
       </w:pPr>
       <w:r>
-        <w:t>06.  The future of professional football  (2016)</w:t>
+        <w:t>06.  Scenarios for population health inequalities in 2030 in Europe  (2020)</w:t>
       </w:r>
     </w:p>
     <w:p>
@@ -343,7 +343,7 @@
         <w:t xml:space="preserve">NOW  </w:t>
       </w:r>
       <w:r>
-        <w:t>A related study appeared in 2018: Economics of professional football.</w:t>
+        <w:t>A related study appeared in 2025: Health System Design and Inequalities in Population Health.</w:t>
       </w:r>
     </w:p>
     <w:p>
@@ -354,7 +354,7 @@
         <w:t xml:space="preserve">WHY HERE  </w:t>
       </w:r>
       <w:r>
-        <w:t>This trail has 4 distinct candidate later paper(s), reaching 2026. Titles suggest a topic connection, not an observed outcome. The publications need source review.</w:t>
+        <w:t>This trail has 3 distinct candidate later paper(s), reaching 2026. Titles suggest a topic connection, not an observed outcome. The publications need source review.</w:t>
       </w:r>
     </w:p>
     <w:p>
@@ -389,7 +389,7 @@
         <w:keepNext/>
       </w:pPr>
       <w:r>
-        <w:t>07.  The future of financial markets and regulation: what strategy for Europe?  (2014)</w:t>
+        <w:t>07.  Integrated assessment of the role of bioenergy within the EU energy transition targets to 2050  (2021)</w:t>
       </w:r>
     </w:p>
     <w:p>
@@ -400,7 +400,7 @@
         <w:t xml:space="preserve">NOW  </w:t>
       </w:r>
       <w:r>
-        <w:t>A related study appeared in 2026: What Is Financial Regulation?.</w:t>
+        <w:t>A related study appeared in 2023: Bioenergy in the European energy transition.</w:t>
       </w:r>
     </w:p>
     <w:p>
@@ -411,7 +411,7 @@
         <w:t xml:space="preserve">WHY HERE  </w:t>
       </w:r>
       <w:r>
-        <w:t>This trail has 6 distinct candidate later paper(s), reaching 2026. Titles suggest a topic connection, not an observed outcome. The publications need source review.</w:t>
+        <w:t>This trail has 3 distinct candidate later paper(s), reaching 2026. Titles suggest a topic connection, not an observed outcome. The publications need source review.</w:t>
       </w:r>
     </w:p>
     <w:p>
@@ -446,7 +446,7 @@
         <w:keepNext/>
       </w:pPr>
       <w:r>
-        <w:t>08.  Technology Planning for Energy and Climate in the US and EU  (2013)</w:t>
+        <w:t>08.  Current challenges and emerging signposts: the future of social work education in Europe  (2017)</w:t>
       </w:r>
     </w:p>
     <w:p>
@@ -457,7 +457,7 @@
         <w:t xml:space="preserve">NOW  </w:t>
       </w:r>
       <w:r>
-        <w:t>A related study appeared in 2024: Research on New Energy Development Planning Technology.</w:t>
+        <w:t>A related study appeared in 2021: Social Work Education in Europe.</w:t>
       </w:r>
     </w:p>
     <w:p>
@@ -468,7 +468,7 @@
         <w:t xml:space="preserve">WHY HERE  </w:t>
       </w:r>
       <w:r>
-        <w:t>This trail has 4 distinct candidate later paper(s), reaching 2025. Titles suggest a topic connection, not an observed outcome. The publications need source review.</w:t>
+        <w:t>This trail has 7 distinct candidate later paper(s), reaching 2026. Titles suggest a topic connection, not an observed outcome. The publications need source review.</w:t>
       </w:r>
     </w:p>
     <w:p>
@@ -503,7 +503,7 @@
         <w:keepNext/>
       </w:pPr>
       <w:r>
-        <w:t>09.  Scenarios for population health inequalities in 2030 in Europe  (2020)</w:t>
+        <w:t>09.  A New Climate for Europe: 2030 Climate Targets Must Be More Ambitious  (2019)</w:t>
       </w:r>
     </w:p>
     <w:p>
@@ -514,7 +514,7 @@
         <w:t xml:space="preserve">NOW  </w:t>
       </w:r>
       <w:r>
-        <w:t>A related study appeared in 2025: Health System Design and Inequalities in Population Health.</w:t>
+        <w:t>A related study appeared in 2022: The UK must be more ambitious.</w:t>
       </w:r>
     </w:p>
     <w:p>
@@ -525,7 +525,7 @@
         <w:t xml:space="preserve">WHY HERE  </w:t>
       </w:r>
       <w:r>
-        <w:t>This trail has 4 distinct candidate later paper(s), reaching 2026. Titles suggest a topic connection, not an observed outcome. The publications need source review.</w:t>
+        <w:t>This trail has 5 distinct candidate later paper(s), reaching 2026. Titles suggest a topic connection, not an observed outcome. The publications need source review.</w:t>
       </w:r>
     </w:p>
     <w:p>
@@ -560,7 +560,7 @@
         <w:keepNext/>
       </w:pPr>
       <w:r>
-        <w:t>10.  Integrated assessment of the role of bioenergy within the EU energy transition targets to 2050  (2021)</w:t>
+        <w:t>10.  Scenario Method in Spatial Research and Planning  (2016)</w:t>
       </w:r>
     </w:p>
     <w:p>
@@ -571,7 +571,7 @@
         <w:t xml:space="preserve">NOW  </w:t>
       </w:r>
       <w:r>
-        <w:t>A related study appeared in 2023: Bioenergy in the European energy transition.</w:t>
+        <w:t>A related study appeared in 2019: Assessment Method for Spatial Planning and Infrastructure Development.</w:t>
       </w:r>
     </w:p>
     <w:p>
@@ -582,7 +582,7 @@
         <w:t xml:space="preserve">WHY HERE  </w:t>
       </w:r>
       <w:r>
-        <w:t>This trail has 4 distinct candidate later paper(s), reaching 2026. Titles suggest a topic connection, not an observed outcome. The publications need source review.</w:t>
+        <w:t>This trail has 3 distinct candidate later paper(s), reaching 2024. Titles suggest a topic connection, not an observed outcome. The publications need source review.</w:t>
       </w:r>
     </w:p>
     <w:p>
@@ -617,7 +617,7 @@
         <w:keepNext/>
       </w:pPr>
       <w:r>
-        <w:t>11.  Current challenges and emerging signposts: the future of social work education in Europe  (2017)</w:t>
+        <w:t>11.  Migration transition in Serbia: demographic perspective  (2013)</w:t>
       </w:r>
     </w:p>
     <w:p>
@@ -628,7 +628,7 @@
         <w:t xml:space="preserve">NOW  </w:t>
       </w:r>
       <w:r>
-        <w:t>A related study appeared in 2021: Social Work Education in Europe.</w:t>
+        <w:t>A related study appeared in 2026: Migration Transition and Migration Governance in Serbia: Beyond Demographic Determinism.</w:t>
       </w:r>
     </w:p>
     <w:p>
@@ -639,7 +639,7 @@
         <w:t xml:space="preserve">WHY HERE  </w:t>
       </w:r>
       <w:r>
-        <w:t>This trail has 8 distinct candidate later paper(s), reaching 2026. Titles suggest a topic connection, not an observed outcome. The publications need source review.</w:t>
+        <w:t>This trail has 7 distinct candidate later paper(s), reaching 2026. Titles suggest a topic connection, not an observed outcome. The publications need source review.</w:t>
       </w:r>
     </w:p>
     <w:p>
@@ -674,7 +674,7 @@
         <w:keepNext/>
       </w:pPr>
       <w:r>
-        <w:t>12.  A New Climate for Europe: 2030 Climate Targets Must Be More Ambitious  (2019)</w:t>
+        <w:t>12.  Scenario planning: An alternative approach to European Commission for combating antimicrobial resistance by 2050  (2021)</w:t>
       </w:r>
     </w:p>
     <w:p>
@@ -685,7 +685,7 @@
         <w:t xml:space="preserve">NOW  </w:t>
       </w:r>
       <w:r>
-        <w:t>A related study appeared in 2022: The UK must be more ambitious.</w:t>
+        <w:t>A related study appeared in 2026: The Global Impact of Combating Antimicrobial Resistance.</w:t>
       </w:r>
     </w:p>
     <w:p>
@@ -696,7 +696,7 @@
         <w:t xml:space="preserve">WHY HERE  </w:t>
       </w:r>
       <w:r>
-        <w:t>This trail has 6 distinct candidate later paper(s), reaching 2026. Titles suggest a topic connection, not an observed outcome. The publications need source review.</w:t>
+        <w:t>This trail has 8 distinct candidate later paper(s), reaching 2026. Titles suggest a topic connection, not an observed outcome. The publications need source review.</w:t>
       </w:r>
     </w:p>
     <w:p>
@@ -731,7 +731,7 @@
         <w:keepNext/>
       </w:pPr>
       <w:r>
-        <w:t>13.  GLOBAL FORECAST OF US NATIONAL INTELLIGENCE COUNCIL  (2016)</w:t>
+        <w:t>13.  ICT in multimodal transport and technological trends: Unleashing potential for the future  (2014)</w:t>
       </w:r>
     </w:p>
     <w:p>
@@ -742,7 +742,7 @@
         <w:t xml:space="preserve">NOW  </w:t>
       </w:r>
       <w:r>
-        <w:t>A related study appeared in 2025: The National Intelligence Council.</w:t>
+        <w:t>A related study appeared in 2016: ICT in multimodal transport and technological trends.</w:t>
       </w:r>
     </w:p>
     <w:p>
@@ -753,7 +753,7 @@
         <w:t xml:space="preserve">WHY HERE  </w:t>
       </w:r>
       <w:r>
-        <w:t>This trail has 3 distinct candidate later paper(s), reaching 2025. Titles suggest a topic connection, not an observed outcome. The publications need source review.</w:t>
+        <w:t>This trail has 4 distinct candidate later paper(s), reaching 2022. Titles suggest a topic connection, not an observed outcome. The publications need source review.</w:t>
       </w:r>
     </w:p>
     <w:p>
@@ -788,7 +788,7 @@
         <w:keepNext/>
       </w:pPr>
       <w:r>
-        <w:t>14.  Scenario Method in Spatial Research and Planning  (2016)</w:t>
+        <w:t>14.  Challenges for the European governance of synthetic biology for human health  (2014)</w:t>
       </w:r>
     </w:p>
     <w:p>
@@ -799,7 +799,7 @@
         <w:t xml:space="preserve">NOW  </w:t>
       </w:r>
       <w:r>
-        <w:t>A related study appeared in 2019: Assessment Method for Spatial Planning and Infrastructure Development.</w:t>
+        <w:t>A related study appeared in 2026: Synthetic biology in human health.</w:t>
       </w:r>
     </w:p>
     <w:p>
@@ -810,7 +810,7 @@
         <w:t xml:space="preserve">WHY HERE  </w:t>
       </w:r>
       <w:r>
-        <w:t>This trail has 3 distinct candidate later paper(s), reaching 2024. Titles suggest a topic connection, not an observed outcome. The publications need source review.</w:t>
+        <w:t>This trail has 7 distinct candidate later paper(s), reaching 2026. Titles suggest a topic connection, not an observed outcome. The publications need source review.</w:t>
       </w:r>
     </w:p>
     <w:p>
@@ -845,7 +845,7 @@
         <w:keepNext/>
       </w:pPr>
       <w:r>
-        <w:t>15.  Migration transition in Serbia: demographic perspective  (2013)</w:t>
+        <w:t>15.  Future making and responsible governance of innovation in synthetic biology  (2018)</w:t>
       </w:r>
     </w:p>
     <w:p>
@@ -856,7 +856,7 @@
         <w:t xml:space="preserve">NOW  </w:t>
       </w:r>
       <w:r>
-        <w:t>A related study appeared in 2026: Migration Transition and Migration Governance in Serbia: Beyond Demographic Determinism.</w:t>
+        <w:t>A related study appeared in 2026: Anticipatory governance for responsible innovation in synthetic biology.</w:t>
       </w:r>
     </w:p>
     <w:p>
@@ -867,7 +867,7 @@
         <w:t xml:space="preserve">WHY HERE  </w:t>
       </w:r>
       <w:r>
-        <w:t>This trail has 7 distinct candidate later paper(s), reaching 2026. Titles suggest a topic connection, not an observed outcome. The publications need source review.</w:t>
+        <w:t>This trail has 12 distinct candidate later paper(s), reaching 2026. Titles suggest a topic connection, not an observed outcome. The publications need source review.</w:t>
       </w:r>
     </w:p>
     <w:p>
@@ -902,7 +902,7 @@
         <w:keepNext/>
       </w:pPr>
       <w:r>
-        <w:t>16.  ICT in multimodal transport and technological trends: Unleashing potential for the future  (2014)</w:t>
+        <w:t>16.  How to finance the transition to low-carbon energy in Europe?  (2020)</w:t>
       </w:r>
     </w:p>
     <w:p>
@@ -913,7 +913,7 @@
         <w:t xml:space="preserve">NOW  </w:t>
       </w:r>
       <w:r>
-        <w:t>A related study appeared in 2016: ICT in multimodal transport and technological trends.</w:t>
+        <w:t>A related study appeared in 2023: Digital finance and the low-carbon energy transition (LCET) from the perspective of capital-biased technical progress.</w:t>
       </w:r>
     </w:p>
     <w:p>
@@ -924,7 +924,7 @@
         <w:t xml:space="preserve">WHY HERE  </w:t>
       </w:r>
       <w:r>
-        <w:t>This trail has 4 distinct candidate later paper(s), reaching 2022. Titles suggest a topic connection, not an observed outcome. The publications need source review.</w:t>
+        <w:t>This trail has 10 distinct candidate later paper(s), reaching 2026. Titles suggest a topic connection, not an observed outcome. The publications need source review.</w:t>
       </w:r>
     </w:p>
     <w:p>
@@ -959,7 +959,7 @@
         <w:keepNext/>
       </w:pPr>
       <w:r>
-        <w:t>17.  Flood risk and climate change: global and regional perspectives  (2013)</w:t>
+        <w:t>17.  Global food security: assessing trends in view of guiding future EU policies  (2016)</w:t>
       </w:r>
     </w:p>
     <w:p>
@@ -970,7 +970,7 @@
         <w:t xml:space="preserve">NOW  </w:t>
       </w:r>
       <w:r>
-        <w:t>A related study appeared in 2017: The global perspectives of flood risk and climate change.</w:t>
+        <w:t>A related study appeared in 2022: Global food security: trends and challenges.</w:t>
       </w:r>
     </w:p>
     <w:p>
@@ -981,7 +981,7 @@
         <w:t xml:space="preserve">WHY HERE  </w:t>
       </w:r>
       <w:r>
-        <w:t>This trail has 8 distinct candidate later paper(s), reaching 2026. Titles suggest a topic connection, not an observed outcome. The publications need source review.</w:t>
+        <w:t>This trail has 4 distinct candidate later paper(s), reaching 2025. Titles suggest a topic connection, not an observed outcome. The publications need source review.</w:t>
       </w:r>
     </w:p>
     <w:p>
@@ -1016,7 +1016,7 @@
         <w:keepNext/>
       </w:pPr>
       <w:r>
-        <w:t>18.  Challenges for the European governance of synthetic biology for human health  (2014)</w:t>
+        <w:t>18.  Potential of extensification of European agriculture for a more sustainable food system, focusing on nitrogen  (2015)</w:t>
       </w:r>
     </w:p>
     <w:p>
@@ -1027,7 +1027,7 @@
         <w:t xml:space="preserve">NOW  </w:t>
       </w:r>
       <w:r>
-        <w:t>A related study appeared in 2026: Synthetic biology in human health.</w:t>
+        <w:t>A related study appeared in 2020: Potential of Extensification of European and Dutch Agriculture for a More Sustainable Food System Focusing on Nitrogen and Livestock.</w:t>
       </w:r>
     </w:p>
     <w:p>
@@ -1038,7 +1038,7 @@
         <w:t xml:space="preserve">WHY HERE  </w:t>
       </w:r>
       <w:r>
-        <w:t>This trail has 10 distinct candidate later paper(s), reaching 2026. Titles suggest a topic connection, not an observed outcome. The publications need source review.</w:t>
+        <w:t>This trail has 5 distinct candidate later paper(s), reaching 2025. Titles suggest a topic connection, not an observed outcome. The publications need source review.</w:t>
       </w:r>
     </w:p>
     <w:p>
@@ -1073,7 +1073,7 @@
         <w:keepNext/>
       </w:pPr>
       <w:r>
-        <w:t>19.  Future making and responsible governance of innovation in synthetic biology  (2018)</w:t>
+        <w:t>19.  Demographic changes in Europe - new challenges for the European labour market  (2013)</w:t>
       </w:r>
     </w:p>
     <w:p>
@@ -1084,7 +1084,7 @@
         <w:t xml:space="preserve">NOW  </w:t>
       </w:r>
       <w:r>
-        <w:t>A related study appeared in 2026: Anticipatory governance for responsible innovation in synthetic biology.</w:t>
+        <w:t>A related study appeared in 2021: Demographic changes and their impact on the labour market.</w:t>
       </w:r>
     </w:p>
     <w:p>
@@ -1095,7 +1095,7 @@
         <w:t xml:space="preserve">WHY HERE  </w:t>
       </w:r>
       <w:r>
-        <w:t>This trail has 12 distinct candidate later paper(s), reaching 2026. Titles suggest a topic connection, not an observed outcome. The publications need source review.</w:t>
+        <w:t>This trail has 7 distinct candidate later paper(s), reaching 2025. Titles suggest a topic connection, not an observed outcome. The publications need source review.</w:t>
       </w:r>
     </w:p>
     <w:p>
@@ -1130,7 +1130,7 @@
         <w:keepNext/>
       </w:pPr>
       <w:r>
-        <w:t>20.  Global food security: assessing trends in view of guiding future EU policies  (2016)</w:t>
+        <w:t>20.  Potential impacts of climate change on European wind energy resource under the CMIP5 future climate projections  (2017)</w:t>
       </w:r>
     </w:p>
     <w:p>
@@ -1141,7 +1141,7 @@
         <w:t xml:space="preserve">NOW  </w:t>
       </w:r>
       <w:r>
-        <w:t>A related study appeared in 2022: Global food security: trends and challenges.</w:t>
+        <w:t>A related study appeared in 2022: A review of recent studies on wind resource projections under climate change.</w:t>
       </w:r>
     </w:p>
     <w:p>
@@ -1152,7 +1152,7 @@
         <w:t xml:space="preserve">WHY HERE  </w:t>
       </w:r>
       <w:r>
-        <w:t>This trail has 4 distinct candidate later paper(s), reaching 2025. Titles suggest a topic connection, not an observed outcome. The publications need source review.</w:t>
+        <w:t>This trail has 3 distinct candidate later paper(s), reaching 2022. Titles suggest a topic connection, not an observed outcome. The publications need source review.</w:t>
       </w:r>
     </w:p>
     <w:p>
@@ -1238,18 +1238,6 @@
           <w:t>Original publication</w:t>
         </w:r>
       </w:hyperlink>
-      <w:r>
-        <w:t xml:space="preserve">   ·   </w:t>
-      </w:r>
-      <w:hyperlink r:id="rId52">
-        <w:r>
-          <w:rPr>
-            <w:color w:val="000000"/>
-            <w:u w:val="single"/>
-          </w:rPr>
-          <w:t>Later publication (check status)</w:t>
-        </w:r>
-      </w:hyperlink>
     </w:p>
     <w:p>
       <w:pPr>
@@ -1286,7 +1274,7 @@
       <w:pPr>
         <w:spacing w:after="160"/>
       </w:pPr>
-      <w:hyperlink r:id="rId53">
+      <w:hyperlink r:id="rId52">
         <w:r>
           <w:rPr>
             <w:color w:val="000000"/>
@@ -1298,7 +1286,7 @@
       <w:r>
         <w:t xml:space="preserve">   ·   </w:t>
       </w:r>
-      <w:hyperlink r:id="rId54">
+      <w:hyperlink r:id="rId53">
         <w:r>
           <w:rPr>
             <w:color w:val="000000"/>
@@ -1314,64 +1302,7 @@
         <w:keepNext/>
       </w:pPr>
       <w:r>
-        <w:t>03.  Towards a green energy economy? Tracking the employment effects of low-carbon technologies in the European Union  (2016)</w:t>
-      </w:r>
-    </w:p>
-    <w:p>
-      <w:r>
-        <w:rPr>
-          <w:b/>
-        </w:rPr>
-        <w:t xml:space="preserve">WHY HERE  </w:t>
-      </w:r>
-      <w:r>
-        <w:t>A possible follow-up is marked withdrawn or retracted and cannot support a positive ranking.</w:t>
-      </w:r>
-    </w:p>
-    <w:p>
-      <w:r>
-        <w:rPr>
-          <w:b/>
-        </w:rPr>
-        <w:t xml:space="preserve">OPEN  </w:t>
-      </w:r>
-      <w:r>
-        <w:t>Still relevant, superseded, or simply under-researched? A source-based review is needed.</w:t>
-      </w:r>
-    </w:p>
-    <w:p>
-      <w:pPr>
-        <w:spacing w:after="160"/>
-      </w:pPr>
-      <w:hyperlink r:id="rId55">
-        <w:r>
-          <w:rPr>
-            <w:color w:val="000000"/>
-            <w:u w:val="single"/>
-          </w:rPr>
-          <w:t>Original publication</w:t>
-        </w:r>
-      </w:hyperlink>
-      <w:r>
-        <w:t xml:space="preserve">   ·   </w:t>
-      </w:r>
-      <w:hyperlink r:id="rId56">
-        <w:r>
-          <w:rPr>
-            <w:color w:val="000000"/>
-            <w:u w:val="single"/>
-          </w:rPr>
-          <w:t>Later publication (check status)</w:t>
-        </w:r>
-      </w:hyperlink>
-    </w:p>
-    <w:p>
-      <w:pPr>
-        <w:pStyle w:val="Heading2"/>
-        <w:keepNext/>
-      </w:pPr>
-      <w:r>
-        <w:t>04.  Benchmarking del programa colombiano de prospectiva ante prácticas en Europa y Sur América (título original: Benchmarking the coloIombian foresight programme against practices in Europe and South America)  (2011)</w:t>
+        <w:t>03.  Benchmarking del programa colombiano de prospectiva ante prácticas en Europa y Sur América (título original: Benchmarking the coloIombian foresight programme against practices in Europe and South America)  (2011)</w:t>
       </w:r>
     </w:p>
     <w:p>
@@ -1400,7 +1331,7 @@
       <w:pPr>
         <w:spacing w:after="160"/>
       </w:pPr>
-      <w:hyperlink r:id="rId57">
+      <w:hyperlink r:id="rId54">
         <w:r>
           <w:rPr>
             <w:color w:val="000000"/>
@@ -1412,7 +1343,7 @@
       <w:r>
         <w:t xml:space="preserve">   ·   </w:t>
       </w:r>
-      <w:hyperlink r:id="rId58">
+      <w:hyperlink r:id="rId55">
         <w:r>
           <w:rPr>
             <w:color w:val="000000"/>
@@ -1428,7 +1359,7 @@
         <w:keepNext/>
       </w:pPr>
       <w:r>
-        <w:t>05.  Reconstructing Native American Migrations from Whole-Genome and Whole-Exome Data  (2013)</w:t>
+        <w:t>04.  Reconstructing Native American Migrations from Whole-Genome and Whole-Exome Data  (2013)</w:t>
       </w:r>
     </w:p>
     <w:p>
@@ -1457,7 +1388,7 @@
       <w:pPr>
         <w:spacing w:after="160"/>
       </w:pPr>
-      <w:hyperlink r:id="rId59">
+      <w:hyperlink r:id="rId56">
         <w:r>
           <w:rPr>
             <w:color w:val="000000"/>
@@ -1469,7 +1400,7 @@
       <w:r>
         <w:t xml:space="preserve">   ·   </w:t>
       </w:r>
-      <w:hyperlink r:id="rId60">
+      <w:hyperlink r:id="rId57">
         <w:r>
           <w:rPr>
             <w:color w:val="000000"/>
@@ -1485,7 +1416,7 @@
         <w:keepNext/>
       </w:pPr>
       <w:r>
-        <w:t>06.  MARKET DRIVEN POWER PLANT INVESTMENT PERSPECTIVES IN EUROPE: CLIMATE POLICY AND TECHNOLOGY SCENARIOS UNTIL 2050 IN THE MODEL EMELIE-ESY  (2013)</w:t>
+        <w:t>05.  MARKET DRIVEN POWER PLANT INVESTMENT PERSPECTIVES IN EUROPE: CLIMATE POLICY AND TECHNOLOGY SCENARIOS UNTIL 2050 IN THE MODEL EMELIE-ESY  (2013)</w:t>
       </w:r>
     </w:p>
     <w:p>
@@ -1514,7 +1445,7 @@
       <w:pPr>
         <w:spacing w:after="160"/>
       </w:pPr>
-      <w:hyperlink r:id="rId61">
+      <w:hyperlink r:id="rId58">
         <w:r>
           <w:rPr>
             <w:color w:val="000000"/>
@@ -1526,7 +1457,7 @@
       <w:r>
         <w:t xml:space="preserve">   ·   </w:t>
       </w:r>
-      <w:hyperlink r:id="rId62">
+      <w:hyperlink r:id="rId59">
         <w:r>
           <w:rPr>
             <w:color w:val="000000"/>
@@ -1542,7 +1473,7 @@
         <w:keepNext/>
       </w:pPr>
       <w:r>
-        <w:t>07.  Making or breaking climate targets: The AMPERE study on staged accession scenarios for climate policy  (2014)</w:t>
+        <w:t>06.  A Mitochondrial Phylogeny and Biogeographical Scenario for Asiatic Water Shrews of the Genus Chimarrogale: Implications for Taxonomy and Low-Latitude Migration Routes  (2013)</w:t>
       </w:r>
     </w:p>
     <w:p>
@@ -1571,7 +1502,7 @@
       <w:pPr>
         <w:spacing w:after="160"/>
       </w:pPr>
-      <w:hyperlink r:id="rId63">
+      <w:hyperlink r:id="rId60">
         <w:r>
           <w:rPr>
             <w:color w:val="000000"/>
@@ -1583,7 +1514,7 @@
       <w:r>
         <w:t xml:space="preserve">   ·   </w:t>
       </w:r>
-      <w:hyperlink r:id="rId64">
+      <w:hyperlink r:id="rId61">
         <w:r>
           <w:rPr>
             <w:color w:val="000000"/>
@@ -1599,7 +1530,7 @@
         <w:keepNext/>
       </w:pPr>
       <w:r>
-        <w:t>08.  Investigating scenario planning – a European tourism perspective  (2015)</w:t>
+        <w:t>07.  Investigating scenario planning – a European tourism perspective  (2015)</w:t>
       </w:r>
     </w:p>
     <w:p>
@@ -1628,7 +1559,7 @@
       <w:pPr>
         <w:spacing w:after="160"/>
       </w:pPr>
-      <w:hyperlink r:id="rId65">
+      <w:hyperlink r:id="rId62">
         <w:r>
           <w:rPr>
             <w:color w:val="000000"/>
@@ -1640,7 +1571,7 @@
       <w:r>
         <w:t xml:space="preserve">   ·   </w:t>
       </w:r>
-      <w:hyperlink r:id="rId66">
+      <w:hyperlink r:id="rId63">
         <w:r>
           <w:rPr>
             <w:color w:val="000000"/>
@@ -1656,7 +1587,7 @@
         <w:keepNext/>
       </w:pPr>
       <w:r>
-        <w:t>09.  Analysis of Execution Methods in U.S. and European Futures  (2015)</w:t>
+        <w:t>08.  A comparison of oil supply risks in EU, US, Japan, China and India under different climate scenarios  (2016)</w:t>
       </w:r>
     </w:p>
     <w:p>
@@ -1685,7 +1616,7 @@
       <w:pPr>
         <w:spacing w:after="160"/>
       </w:pPr>
-      <w:hyperlink r:id="rId67">
+      <w:hyperlink r:id="rId64">
         <w:r>
           <w:rPr>
             <w:color w:val="000000"/>
@@ -1697,7 +1628,7 @@
       <w:r>
         <w:t xml:space="preserve">   ·   </w:t>
       </w:r>
-      <w:hyperlink r:id="rId68">
+      <w:hyperlink r:id="rId65">
         <w:r>
           <w:rPr>
             <w:color w:val="000000"/>
@@ -1713,7 +1644,7 @@
         <w:keepNext/>
       </w:pPr>
       <w:r>
-        <w:t>10.  Lyme Disease Risks in Europe under Multiple Uncertain Drivers of Change  (2019)</w:t>
+        <w:t>09.  Lyme Disease Risks in Europe under Multiple Uncertain Drivers of Change  (2019)</w:t>
       </w:r>
     </w:p>
     <w:p>
@@ -1742,7 +1673,7 @@
       <w:pPr>
         <w:spacing w:after="160"/>
       </w:pPr>
-      <w:hyperlink r:id="rId69">
+      <w:hyperlink r:id="rId66">
         <w:r>
           <w:rPr>
             <w:color w:val="000000"/>
@@ -1754,7 +1685,7 @@
       <w:r>
         <w:t xml:space="preserve">   ·   </w:t>
       </w:r>
-      <w:hyperlink r:id="rId70">
+      <w:hyperlink r:id="rId67">
         <w:r>
           <w:rPr>
             <w:color w:val="000000"/>
@@ -1770,7 +1701,7 @@
         <w:keepNext/>
       </w:pPr>
       <w:r>
-        <w:t>11.  Disaggregation of official demographic projections in sub-groups by education level: the neglected “composition effect” in the future path of life expectancy  (2021)</w:t>
+        <w:t>10.  Horizon Scanning in Foresight – Why Horizon Scanning is only a part of the game  (2019)</w:t>
       </w:r>
     </w:p>
     <w:p>
@@ -1799,7 +1730,7 @@
       <w:pPr>
         <w:spacing w:after="160"/>
       </w:pPr>
-      <w:hyperlink r:id="rId71">
+      <w:hyperlink r:id="rId68">
         <w:r>
           <w:rPr>
             <w:color w:val="000000"/>
@@ -1811,7 +1742,7 @@
       <w:r>
         <w:t xml:space="preserve">   ·   </w:t>
       </w:r>
-      <w:hyperlink r:id="rId72">
+      <w:hyperlink r:id="rId69">
         <w:r>
           <w:rPr>
             <w:color w:val="000000"/>
@@ -1827,7 +1758,121 @@
         <w:keepNext/>
       </w:pPr>
       <w:r>
-        <w:t>12.  Forest policy in Europe and 2020 scenarios: between sustainability and rural development  (2012)</w:t>
+        <w:t>11.  From bioethanol containing fuels towards a fuel economy that includes methanol derived from renewable sources and the impact on European Union decision-making on transition pathways  (2019)</w:t>
+      </w:r>
+    </w:p>
+    <w:p>
+      <w:r>
+        <w:rPr>
+          <w:b/>
+        </w:rPr>
+        <w:t xml:space="preserve">WHY HERE  </w:t>
+      </w:r>
+      <w:r>
+        <w:t>The apparent later evidence closely repeats the original or another linked publication. An independent follow-up has not been established.</w:t>
+      </w:r>
+    </w:p>
+    <w:p>
+      <w:r>
+        <w:rPr>
+          <w:b/>
+        </w:rPr>
+        <w:t xml:space="preserve">OPEN  </w:t>
+      </w:r>
+      <w:r>
+        <w:t>Still relevant, superseded, or simply under-researched? A source-based review is needed.</w:t>
+      </w:r>
+    </w:p>
+    <w:p>
+      <w:pPr>
+        <w:spacing w:after="160"/>
+      </w:pPr>
+      <w:hyperlink r:id="rId70">
+        <w:r>
+          <w:rPr>
+            <w:color w:val="000000"/>
+            <w:u w:val="single"/>
+          </w:rPr>
+          <w:t>Original publication</w:t>
+        </w:r>
+      </w:hyperlink>
+      <w:r>
+        <w:t xml:space="preserve">   ·   </w:t>
+      </w:r>
+      <w:hyperlink r:id="rId71">
+        <w:r>
+          <w:rPr>
+            <w:color w:val="000000"/>
+            <w:u w:val="single"/>
+          </w:rPr>
+          <w:t>Later publication (check status)</w:t>
+        </w:r>
+      </w:hyperlink>
+    </w:p>
+    <w:p>
+      <w:pPr>
+        <w:pStyle w:val="Heading2"/>
+        <w:keepNext/>
+      </w:pPr>
+      <w:r>
+        <w:t>12.  Disaggregation of official demographic projections in sub-groups by education level: the neglected “composition effect” in the future path of life expectancy  (2021)</w:t>
+      </w:r>
+    </w:p>
+    <w:p>
+      <w:r>
+        <w:rPr>
+          <w:b/>
+        </w:rPr>
+        <w:t xml:space="preserve">WHY HERE  </w:t>
+      </w:r>
+      <w:r>
+        <w:t>The apparent later evidence closely repeats the original or another linked publication. An independent follow-up has not been established.</w:t>
+      </w:r>
+    </w:p>
+    <w:p>
+      <w:r>
+        <w:rPr>
+          <w:b/>
+        </w:rPr>
+        <w:t xml:space="preserve">OPEN  </w:t>
+      </w:r>
+      <w:r>
+        <w:t>Still relevant, superseded, or simply under-researched? A source-based review is needed.</w:t>
+      </w:r>
+    </w:p>
+    <w:p>
+      <w:pPr>
+        <w:spacing w:after="160"/>
+      </w:pPr>
+      <w:hyperlink r:id="rId72">
+        <w:r>
+          <w:rPr>
+            <w:color w:val="000000"/>
+            <w:u w:val="single"/>
+          </w:rPr>
+          <w:t>Original publication</w:t>
+        </w:r>
+      </w:hyperlink>
+      <w:r>
+        <w:t xml:space="preserve">   ·   </w:t>
+      </w:r>
+      <w:hyperlink r:id="rId73">
+        <w:r>
+          <w:rPr>
+            <w:color w:val="000000"/>
+            <w:u w:val="single"/>
+          </w:rPr>
+          <w:t>Later publication (check status)</w:t>
+        </w:r>
+      </w:hyperlink>
+    </w:p>
+    <w:p>
+      <w:pPr>
+        <w:pStyle w:val="Heading2"/>
+        <w:keepNext/>
+      </w:pPr>
+      <w:r>
+        <w:t>13.  Long-term projections and acclimatization scenarios of temperature-related mortality in Europe  (2011)</w:t>
       </w:r>
     </w:p>
     <w:p>
@@ -1856,7 +1901,7 @@
       <w:pPr>
         <w:spacing w:after="160"/>
       </w:pPr>
-      <w:hyperlink r:id="rId73">
+      <w:hyperlink r:id="rId74">
         <w:r>
           <w:rPr>
             <w:color w:val="000000"/>
@@ -1868,7 +1913,7 @@
       <w:r>
         <w:t xml:space="preserve">   ·   </w:t>
       </w:r>
-      <w:hyperlink r:id="rId74">
+      <w:hyperlink r:id="rId75">
         <w:r>
           <w:rPr>
             <w:color w:val="000000"/>
@@ -1884,7 +1929,7 @@
         <w:keepNext/>
       </w:pPr>
       <w:r>
-        <w:t>13.  Environment, migration and the European demographic deficit  (2012)</w:t>
+        <w:t>14.  Forest policy in Europe and 2020 scenarios: between sustainability and rural development  (2012)</w:t>
       </w:r>
     </w:p>
     <w:p>
@@ -1913,7 +1958,7 @@
       <w:pPr>
         <w:spacing w:after="160"/>
       </w:pPr>
-      <w:hyperlink r:id="rId75">
+      <w:hyperlink r:id="rId76">
         <w:r>
           <w:rPr>
             <w:color w:val="000000"/>
@@ -1925,7 +1970,7 @@
       <w:r>
         <w:t xml:space="preserve">   ·   </w:t>
       </w:r>
-      <w:hyperlink r:id="rId76">
+      <w:hyperlink r:id="rId77">
         <w:r>
           <w:rPr>
             <w:color w:val="000000"/>
@@ -1941,7 +1986,7 @@
         <w:keepNext/>
       </w:pPr>
       <w:r>
-        <w:t>14.  Demographic Epidemiologic Projections of Long-Term Care Needs in Selected European Countries: Germany, Spain, the Netherlands and Poland  (2012)</w:t>
+        <w:t>15.  Environment, migration and the European demographic deficit  (2012)</w:t>
       </w:r>
     </w:p>
     <w:p>
@@ -1970,7 +2015,7 @@
       <w:pPr>
         <w:spacing w:after="160"/>
       </w:pPr>
-      <w:hyperlink r:id="rId77">
+      <w:hyperlink r:id="rId78">
         <w:r>
           <w:rPr>
             <w:color w:val="000000"/>
@@ -1982,7 +2027,7 @@
       <w:r>
         <w:t xml:space="preserve">   ·   </w:t>
       </w:r>
-      <w:hyperlink r:id="rId78">
+      <w:hyperlink r:id="rId79">
         <w:r>
           <w:rPr>
             <w:color w:val="000000"/>
@@ -1998,7 +2043,7 @@
         <w:keepNext/>
       </w:pPr>
       <w:r>
-        <w:t>15.  Why Demographic Suicide? The Puzzles of European Fertility  (2013)</w:t>
+        <w:t>16.  Demographic Epidemiologic Projections of Long-Term Care Needs in Selected European Countries: Germany, Spain, the Netherlands and Poland  (2012)</w:t>
       </w:r>
     </w:p>
     <w:p>
@@ -2027,7 +2072,7 @@
       <w:pPr>
         <w:spacing w:after="160"/>
       </w:pPr>
-      <w:hyperlink r:id="rId79">
+      <w:hyperlink r:id="rId80">
         <w:r>
           <w:rPr>
             <w:color w:val="000000"/>
@@ -2039,64 +2084,7 @@
       <w:r>
         <w:t xml:space="preserve">   ·   </w:t>
       </w:r>
-      <w:hyperlink r:id="rId80">
-        <w:r>
-          <w:rPr>
-            <w:color w:val="000000"/>
-            <w:u w:val="single"/>
-          </w:rPr>
-          <w:t>Later publication (check status)</w:t>
-        </w:r>
-      </w:hyperlink>
-    </w:p>
-    <w:p>
-      <w:pPr>
-        <w:pStyle w:val="Heading2"/>
-        <w:keepNext/>
-      </w:pPr>
-      <w:r>
-        <w:t>16.  Scenarios for selected maritime economic functions  (2013)</w:t>
-      </w:r>
-    </w:p>
-    <w:p>
-      <w:r>
-        <w:rPr>
-          <w:b/>
-        </w:rPr>
-        <w:t xml:space="preserve">WHY HERE  </w:t>
-      </w:r>
-      <w:r>
-        <w:t>The available newer titles do not establish a close subject match. The link could be tangential and needs checking.</w:t>
-      </w:r>
-    </w:p>
-    <w:p>
-      <w:r>
-        <w:rPr>
-          <w:b/>
-        </w:rPr>
-        <w:t xml:space="preserve">OPEN  </w:t>
-      </w:r>
-      <w:r>
-        <w:t>Still relevant, superseded, or simply under-researched? A source-based review is needed.</w:t>
-      </w:r>
-    </w:p>
-    <w:p>
-      <w:pPr>
-        <w:spacing w:after="160"/>
-      </w:pPr>
       <w:hyperlink r:id="rId81">
-        <w:r>
-          <w:rPr>
-            <w:color w:val="000000"/>
-            <w:u w:val="single"/>
-          </w:rPr>
-          <w:t>Original publication</w:t>
-        </w:r>
-      </w:hyperlink>
-      <w:r>
-        <w:t xml:space="preserve">   ·   </w:t>
-      </w:r>
-      <w:hyperlink r:id="rId82">
         <w:r>
           <w:rPr>
             <w:color w:val="000000"/>
@@ -2141,7 +2129,7 @@
       <w:pPr>
         <w:spacing w:after="160"/>
       </w:pPr>
-      <w:hyperlink r:id="rId83">
+      <w:hyperlink r:id="rId82">
         <w:r>
           <w:rPr>
             <w:color w:val="000000"/>
@@ -2153,7 +2141,7 @@
       <w:r>
         <w:t xml:space="preserve">   ·   </w:t>
       </w:r>
-      <w:hyperlink r:id="rId84">
+      <w:hyperlink r:id="rId83">
         <w:r>
           <w:rPr>
             <w:color w:val="000000"/>
@@ -2198,7 +2186,7 @@
       <w:pPr>
         <w:spacing w:after="160"/>
       </w:pPr>
-      <w:hyperlink r:id="rId85">
+      <w:hyperlink r:id="rId84">
         <w:r>
           <w:rPr>
             <w:color w:val="000000"/>
@@ -2210,7 +2198,7 @@
       <w:r>
         <w:t xml:space="preserve">   ·   </w:t>
       </w:r>
-      <w:hyperlink r:id="rId86">
+      <w:hyperlink r:id="rId85">
         <w:r>
           <w:rPr>
             <w:color w:val="000000"/>
@@ -2255,7 +2243,7 @@
       <w:pPr>
         <w:spacing w:after="160"/>
       </w:pPr>
-      <w:hyperlink r:id="rId87">
+      <w:hyperlink r:id="rId86">
         <w:r>
           <w:rPr>
             <w:color w:val="000000"/>
@@ -2267,7 +2255,7 @@
       <w:r>
         <w:t xml:space="preserve">   ·   </w:t>
       </w:r>
-      <w:hyperlink r:id="rId88">
+      <w:hyperlink r:id="rId87">
         <w:r>
           <w:rPr>
             <w:color w:val="000000"/>
@@ -2312,7 +2300,7 @@
       <w:pPr>
         <w:spacing w:after="160"/>
       </w:pPr>
-      <w:hyperlink r:id="rId89">
+      <w:hyperlink r:id="rId88">
         <w:r>
           <w:rPr>
             <w:color w:val="000000"/>
@@ -2324,7 +2312,7 @@
       <w:r>
         <w:t xml:space="preserve">   ·   </w:t>
       </w:r>
-      <w:hyperlink r:id="rId90">
+      <w:hyperlink r:id="rId89">
         <w:r>
           <w:rPr>
             <w:color w:val="000000"/>

</xml_diff>